<commit_message>
BRD v1.9: finalise tenant billing layout in section 11.2
Current charges summary card, 6-cycle invoice list with per-month
Export, and the pricing info note now recorded in the screen
composition; version-history entry extended.

Co-Authored-By: Claude Fable 5 <noreply@anthropic.com>
Claude-Session: https://claude.ai/code/session_01K4sYx62rsZE8FLFyiFKqEH
</commit_message>
<xml_diff>
--- a/docs/Appro_BRD_BillingSubscription_v1.9.docx
+++ b/docs/Appro_BRD_BillingSubscription_v1.9.docx
@@ -677,7 +677,7 @@
               <w:rPr>
                 <w:color w:val="7A1FA2"/>
               </w:rPr>
-              <w:t xml:space="preserve">Added the Tenant Portal — Subscriptions &amp; Billing view (read-only Overview): scope and RBAC gate, screen composition, per-month invoice export, consumption &amp; billing parameters table; no payment-method section on the tenant side. New section 11.</w:t>
+              <w:t xml:space="preserve">Added the Tenant Portal — Subscriptions &amp; Billing view (read-only Overview): scope and RBAC gate, screen composition, per-month invoice export, consumption &amp; billing parameters table; no payment-method section on the tenant side. New section 11. Layout finalised same day: right-column Current charges summary card, 6-cycle invoice list with per-month Export, pricing info note.</w:t>
             </w:r>
           </w:p>
         </w:tc>
@@ -13086,7 +13086,25 @@
         <w:ind w:left="360"/>
       </w:pPr>
       <w:r>
-        <w:t xml:space="preserve">• Invoices — one row per month with amount and a status pill (Paid / Pending; the open cycle stays Pending until settled), listed newest first.</w:t>
+        <w:t xml:space="preserve">• Invoices — one row per month for the last 6 cycles (matching the trend chart), listed newest first, each with amount, a status pill (Paid / Pending; the open cycle stays Pending until settled) and an Export action (see 11.4).</w:t>
+      </w:r>
+    </w:p>
+    <w:p>
+      <w:pPr>
+        <w:spacing w:after="60"/>
+        <w:ind w:left="360"/>
+      </w:pPr>
+      <w:r>
+        <w:t xml:space="preserve">• Current charges — right-column summary card: Subtotal (before VAT), VAT (5%), Total due (emphasised) and the invoice issue date with the billed organization. Figures equal the Line-items footer.</w:t>
+      </w:r>
+    </w:p>
+    <w:p>
+      <w:pPr>
+        <w:spacing w:after="60"/>
+        <w:ind w:left="360"/>
+      </w:pPr>
+      <w:r>
+        <w:t xml:space="preserve">• Pricing info note — static panel: "Pricing &amp; packages are configured by Appro. For a plan change or a billing question, contact your account manager." No action attached.</w:t>
       </w:r>
     </w:p>
     <w:p>

</xml_diff>